<commit_message>
B2 换为 El País 原文，移除 Japan Times 残留
</commit_message>
<xml_diff>
--- a/articles/2026-08-20.docx
+++ b/articles/2026-08-20.docx
@@ -5859,7 +5859,7 @@
         <w:pStyle w:val="Heading2"/>
       </w:pPr>
       <w:r>
-        <w:t>La prórroga de la central nuclear de Almaraz: un debate europeo</w:t>
+        <w:t>La prórroga de Almaraz dejará en manos de un futuro Gobierno la decisión sobre su cierre</w:t>
       </w:r>
     </w:p>
     <w:p>
@@ -5869,7 +5869,7 @@
           <w:color w:val="99AABB"/>
           <w:sz w:val="18"/>
         </w:rPr>
-        <w:t>来源：Japan Times</w:t>
+        <w:t>来源：El País</w:t>
       </w:r>
     </w:p>
     <w:p/>
@@ -5881,7 +5881,7 @@
           <w:color w:val="1A56DB"/>
           <w:sz w:val="22"/>
         </w:rPr>
-        <w:t>[1] La decisión del Gobierno español de prolongar la vida de la central nuclear de Almaraz ha reabierto un viejo debate: ¿cuál es el papel de la energía nuclear en la transición energética?</w:t>
+        <w:t>[1] El Gobierno ha dado una patada hacia adelante con la prórroga de la central nuclear de Almaraz, anunciada por el Ministerio para la Transición Ecológica.</w:t>
       </w:r>
     </w:p>
     <w:p>
@@ -5891,7 +5891,7 @@
           <w:color w:val="556677"/>
           <w:sz w:val="20"/>
         </w:rPr>
-        <w:t>西班牙政府决定延长阿尔马拉斯核电站的使用寿命，重新引发了一场旧有的争论：核能在能源转型中究竟应扮演什么角色？</w:t>
+        <w:t>政府通过生态转型部宣布的阿尔马拉斯核电站延期，实际上是把问题“往后踢了一脚”。</w:t>
       </w:r>
     </w:p>
     <w:p/>
@@ -5903,7 +5903,7 @@
           <w:color w:val="1A56DB"/>
           <w:sz w:val="22"/>
         </w:rPr>
-        <w:t>[2] Almaraz, situada en la región occidental de Extremadura, estaba prevista para cerrar en 2028, dentro del plan oficial de apagar todos los reactores nucleares en 2035.</w:t>
+        <w:t>[2] La instalación, que produce en sus dos reactores en torno al 7% de la energía eléctrica que consume España, seguirá abierta hasta junio de 2030.</w:t>
       </w:r>
     </w:p>
     <w:p>
@@ -5913,7 +5913,7 @@
           <w:color w:val="556677"/>
           <w:sz w:val="20"/>
         </w:rPr>
-        <w:t>位于西部埃斯特雷马杜拉地区的阿尔马拉斯核电站，原定于 2028 年关闭，这是到 2035 年关停所有核反应堆的官方计划的一部分。</w:t>
+        <w:t>该设施的两个反应堆生产着西班牙约 7% 的电力，将继续运行到 2030 年 6 月。</w:t>
       </w:r>
     </w:p>
     <w:p/>
@@ -5925,7 +5925,7 @@
           <w:color w:val="1A56DB"/>
           <w:sz w:val="22"/>
         </w:rPr>
-        <w:t>[3] Sin embargo, las tres empresas propietarias de la central — Iberdrola, Endesa y Naturgy — pidieron al Gobierno mantenerla en funcionamiento dos años más.</w:t>
+        <w:t>[3] Con esta decisión, se incumple el calendario de clausura pactado entre los socios de la coalición del Gobierno.</w:t>
       </w:r>
     </w:p>
     <w:p>
@@ -5935,7 +5935,7 @@
           <w:color w:val="556677"/>
           <w:sz w:val="20"/>
         </w:rPr>
-        <w:t>然而，该核电站的三家业主公司——伊维尔德罗拉、恩德萨和纳图尔吉——请求政府让其再运行两年。</w:t>
+        <w:t>这一决定违反了执政联盟各政党之间达成的关闭时间表。</w:t>
       </w:r>
     </w:p>
     <w:p/>
@@ -5947,7 +5947,7 @@
           <w:color w:val="1A56DB"/>
           <w:sz w:val="22"/>
         </w:rPr>
-        <w:t>[4] El año pasado, un apagón masivo sin precedentes y la subida de los precios de la energía causada por la guerra en Oriente Medio reavivaron el debate sobre el cierre nuclear.</w:t>
+        <w:t>[4] Aunque el Ejecutivo asegura que el impacto es limitado, lo cierto es que el primer cierre queda ahora fijado para una nueva legislatura, con una nueva administración en La Moncloa.</w:t>
       </w:r>
     </w:p>
     <w:p>
@@ -5957,7 +5957,7 @@
           <w:color w:val="556677"/>
           <w:sz w:val="20"/>
         </w:rPr>
-        <w:t>去年，一场史无前例的大规模停电，以及中东战争引发的能源价格上涨，重新点燃了关于核电关停的辩论。</w:t>
+        <w:t>尽管政府保证影响有限，但事实上第一次关闭现在被推迟到了新一届议会任期，届时蒙克洛亚宫（首相府）将是新的执政班子。</w:t>
       </w:r>
     </w:p>
     <w:p/>
@@ -5969,7 +5969,7 @@
           <w:color w:val="1A56DB"/>
           <w:sz w:val="22"/>
         </w:rPr>
-        <w:t>[5] Finalmente, una orden ministerial publicada el miércoles autorizó la prórroga de Almaraz hasta el 8 de junio de 2030.</w:t>
+        <w:t>[5] El Partido Popular dejó claro que la moratoria es “insuficiente” y fue un paso más allá al insistir en que debe “cancelarse” el calendario de cierres.</w:t>
       </w:r>
     </w:p>
     <w:p>
@@ -5979,7 +5979,7 @@
           <w:color w:val="556677"/>
           <w:sz w:val="20"/>
         </w:rPr>
-        <w:t>最终，周三公布的一项部长令批准将阿尔马拉斯核电站延期至 2030 年 6 月 8 日。</w:t>
+        <w:t>人民党明确表示，这次“暂停关闭”是“不够的”，并进一步坚持应该“取消”整个关闭时间表。</w:t>
       </w:r>
     </w:p>
     <w:p/>
@@ -5991,7 +5991,7 @@
           <w:color w:val="1A56DB"/>
           <w:sz w:val="22"/>
         </w:rPr>
-        <w:t>[6] En el texto oficial, el Gobierno justificó la medida asegurando que “la prórroga limitada... mitiga la exposición del sistema eléctrico y de los consumidores a subidas de precios imprevistas”.</w:t>
+        <w:t>[6] Fuentes del sector eléctrico aseguran que parte de la estrategia de las compañías y de la propia central pasaba por ganar tiempo y conseguir una revisión de la política nuclear.</w:t>
       </w:r>
     </w:p>
     <w:p>
@@ -6001,7 +6001,7 @@
           <w:color w:val="556677"/>
           <w:sz w:val="20"/>
         </w:rPr>
-        <w:t>在官方文件中，政府为这一措施辩解，称“有限的延期……减轻了电力系统和消费者面临不可预见的电价上涨的风险敞口”。</w:t>
+        <w:t>电力行业消息人士称，各公司和核电站本身的策略之一，就是争取时间，并推动对核电政策的重新审查。</w:t>
       </w:r>
     </w:p>
     <w:p/>
@@ -6013,7 +6013,7 @@
           <w:color w:val="1A56DB"/>
           <w:sz w:val="22"/>
         </w:rPr>
-        <w:t>[7] El Ejecutivo insistió en que las renovables y el almacenamiento seguirán siendo “las soluciones estructurales” frente a la dependencia de los combustibles fósiles.</w:t>
+        <w:t>[7] Aspiran a llevar la clausura de la central hasta 2060, mucho más allá del calendario actual.</w:t>
       </w:r>
     </w:p>
     <w:p>
@@ -6023,7 +6023,7 @@
           <w:color w:val="556677"/>
           <w:sz w:val="20"/>
         </w:rPr>
-        <w:t>政府坚称，可再生能源和储能仍将是应对化石燃料依赖的“结构性解决方案”。</w:t>
+        <w:t>它们希望把核电站的关闭推迟到 2060 年，远超当前的时间表。</w:t>
       </w:r>
     </w:p>
     <w:p/>
@@ -6035,7 +6035,7 @@
           <w:color w:val="1A56DB"/>
           <w:sz w:val="22"/>
         </w:rPr>
-        <w:t>[8] También aseguró que la extensión “tiene un impacto muy limitado” en la política energética y “no altera el resto del calendario”, incluida la eliminación total de la energía nuclear en 2035.</w:t>
+        <w:t>[8] Para el PSOE, que en octubre de 2023 pactó con Sumar un cierre “planificado, seguro, ordenado y justo socialmente” entre 2027 y 2035, la cuestión tampoco es sencilla.</w:t>
       </w:r>
     </w:p>
     <w:p>
@@ -6045,7 +6045,7 @@
           <w:color w:val="556677"/>
           <w:sz w:val="20"/>
         </w:rPr>
-        <w:t>政府还保证，这次延期对能源政策“影响非常有限”，且“不会改变其余时间表”，包括 2035 年彻底淘汰核电。</w:t>
+        <w:t>对工人社会党（PSOE）来说，这也不是个简单的问题——它曾在 2023 年 10 月与苏马尔党商定，在 2027 至 2035 年间“有计划、安全、有序且社会公正地”关闭核电站。</w:t>
       </w:r>
     </w:p>
     <w:p/>
@@ -6057,7 +6057,7 @@
           <w:color w:val="1A56DB"/>
           <w:sz w:val="22"/>
         </w:rPr>
-        <w:t>[9] Sin embargo, la decisión no ha sido bien recibida por todos. Sumar, el socio menor de la coalición de Gobierno, la criticó con dureza.</w:t>
+        <w:t>[9] Con la última decisión, el Gobierno no solo cede a las presiones de los municipios cercanos y de las energéticas dueñas de la central (Iberdrola, Endesa y Naturgy), sino también a las de los partidos políticos de la región.</w:t>
       </w:r>
     </w:p>
     <w:p>
@@ -6067,7 +6067,7 @@
           <w:color w:val="556677"/>
           <w:sz w:val="20"/>
         </w:rPr>
-        <w:t>然而，这一决定并未得到所有人的认可。执政联盟中的小党“苏马尔”对其进行了严厉批评。</w:t>
+        <w:t>通过这项最新决定，政府不仅屈服于核电站周边市镇和业主公司（伊维尔德罗拉、恩德萨、纳图尔吉）的压力，也屈服于当地政党的压力。</w:t>
       </w:r>
     </w:p>
     <w:p/>
@@ -6079,7 +6079,7 @@
           <w:color w:val="1A56DB"/>
           <w:sz w:val="22"/>
         </w:rPr>
-        <w:t>[10] Sumar calificó la decisión de basarse en “presión empresarial” y no en “necesidades técnicas y ambientales o en la competitividad económica”.</w:t>
+        <w:t>[10] El propio PSOE extremeño celebró la decisión en un comunicado, calificándola de “una muy buena noticia para Extremadura, para el Campo Arañuelo, para Almaraz y para España en su conjunto”.</w:t>
       </w:r>
     </w:p>
     <w:p>
@@ -6089,7 +6089,7 @@
           <w:color w:val="556677"/>
           <w:sz w:val="20"/>
         </w:rPr>
-        <w:t>苏马尔党指责该决定是基于“企业施压”，而非“技术和环境需求或经济竞争力”。</w:t>
+        <w:t>埃斯特雷马杜拉的工人社会党在一份声明中对这一决定表示欢迎，称这是“对埃斯特雷马杜拉、对阿拉纽埃洛地区、对阿尔马拉斯乃至对整个西班牙都非常好的消息”。</w:t>
       </w:r>
     </w:p>
     <w:p/>
@@ -6101,7 +6101,7 @@
           <w:color w:val="1A56DB"/>
           <w:sz w:val="22"/>
         </w:rPr>
-        <w:t>[11] En un comunicado, Sumar afirmó que “seguir superando la vida útil de esta infraestructura retrasa la descarbonización real basada en renovables e impone costes y riesgos inaceptables a la sociedad”.</w:t>
+        <w:t>[11] El Ministerio de Transición Ecológica defendió la decisión argumentando que la prórroga es segura, no compromete el suministro y no supondrá un coste extra.</w:t>
       </w:r>
     </w:p>
     <w:p>
@@ -6111,7 +6111,7 @@
           <w:color w:val="556677"/>
           <w:sz w:val="20"/>
         </w:rPr>
-        <w:t>在一份声明中，苏马尔党表示“继续超期运行这一基础设施，会推迟基于可再生能源的真正脱碳，并给社会带来不可接受的成本和风险”。</w:t>
+        <w:t>生态转型部为这一决定辩护，称延期是安全的、不会危及电力供应，也不会带来额外成本。</w:t>
       </w:r>
     </w:p>
     <w:p/>
@@ -6123,7 +6123,7 @@
           <w:color w:val="1A56DB"/>
           <w:sz w:val="22"/>
         </w:rPr>
-        <w:t>[12] También sostuvo que la medida “encarece el precio de la energía”, contradiciendo así el principal argumento del Gobierno.</w:t>
+        <w:t>[12] Cabe recordar que la instalación está valorada en 15.000 millones de euros.</w:t>
       </w:r>
     </w:p>
     <w:p>
@@ -6133,7 +6133,7 @@
           <w:color w:val="556677"/>
           <w:sz w:val="20"/>
         </w:rPr>
-        <w:t>该党还认为，这一措施“推高了能源价格”，从而与政府的主要论点相矛盾。</w:t>
+        <w:t>需要提醒的是，该设施估值高达 150 亿欧元。</w:t>
       </w:r>
     </w:p>
     <w:p/>
@@ -6145,7 +6145,7 @@
           <w:color w:val="1A56DB"/>
           <w:sz w:val="22"/>
         </w:rPr>
-        <w:t>[13] El Gobierno, por su parte, había advertido previamente que cualquier prórroga dependería de que la central cumpliera todos los estándares de seguridad y no impusiera costes adicionales a los contribuyentes.</w:t>
+        <w:t>[13] Además, el Ministerio resaltó que el escenario geopolítico actual ha generado “una volatilidad de precios” en la energía.</w:t>
       </w:r>
     </w:p>
     <w:p>
@@ -6155,7 +6155,7 @@
           <w:color w:val="556677"/>
           <w:sz w:val="20"/>
         </w:rPr>
-        <w:t>政府方面此前曾警告说，任何延期都将取决于该核电站是否满足所有安全标准，且不给纳税人带来额外成本。</w:t>
+        <w:t>此外，该部强调，当前的地缘政治局势造成了能源“价格波动”。</w:t>
       </w:r>
     </w:p>
     <w:p/>
@@ -6167,7 +6167,7 @@
           <w:color w:val="1A56DB"/>
           <w:sz w:val="22"/>
         </w:rPr>
-        <w:t>[14] La central de Almaraz aporta alrededor del 7% de la producción eléctrica de España y es una fuente clave de industria y empleo en la Extremadura rural y despoblada.</w:t>
+        <w:t>[14] Según el Gobierno, “la prórroga, coyuntural, puede contribuir a moderar la exposición de los consumidores a unos picos de precios de los combustibles fósiles no previstos anteriormente”.</w:t>
       </w:r>
     </w:p>
     <w:p>
@@ -6177,7 +6177,7 @@
           <w:color w:val="556677"/>
           <w:sz w:val="20"/>
         </w:rPr>
-        <w:t>阿尔马拉斯核电站贡献了西班牙约 7% 的电力生产，是人口稀少的埃斯特雷马杜拉农村地区重要的产业和就业来源。</w:t>
+        <w:t>据政府称，“这一临时性的延期有助于减轻消费者面临化石燃料价格此前未预见的飙升的风险敞口”。</w:t>
       </w:r>
     </w:p>
     <w:p/>
@@ -6189,7 +6189,7 @@
           <w:color w:val="1A56DB"/>
           <w:sz w:val="22"/>
         </w:rPr>
-        <w:t>[15] La presidenta regional, María Guardiola, celebró la decisión en las redes sociales, calificándola de “una decisión que aporta certeza” y que protege “una actividad esencial para la vida de tantos pueblos y familias”.</w:t>
+        <w:t>[15] “España no puede permitirse el lujo de cerrar las nucleares”, aseguraba hace tan solo un par de meses el consejero delegado de Iberdrola España, Mario Ruiz-Tagle.</w:t>
       </w:r>
     </w:p>
     <w:p>
@@ -6199,7 +6199,7 @@
           <w:color w:val="556677"/>
           <w:sz w:val="20"/>
         </w:rPr>
-        <w:t>该地区领导人玛丽亚·瓜迪奥拉在社交媒体上对这一决定表示欢迎，称这是“一项带来确定性的决定”，并保护了“对众多村镇和家庭生活至关重要的产业”。</w:t>
+        <w:t>“西班牙承受不起关闭核电站的代价”，伊维尔德罗拉西班牙公司首席执行官马里奥·鲁伊斯-塔格莱就在两个月前还这样表示。</w:t>
       </w:r>
     </w:p>
     <w:p/>
@@ -6211,7 +6211,7 @@
           <w:color w:val="1A56DB"/>
           <w:sz w:val="22"/>
         </w:rPr>
-        <w:t>[16] El caso español refleja un giro más amplio en Europa, donde varios países están reevaluando el cierre de sus centrales nucleares ante la crisis energética.</w:t>
+        <w:t>[16] Estas declaraciones se produjeron poco antes de conocerse el informe del Consejo de Seguridad Nuclear, que daba luz verde a la prórroga hasta 2030 con ciertas condiciones.</w:t>
       </w:r>
     </w:p>
     <w:p>
@@ -6221,7 +6221,7 @@
           <w:color w:val="556677"/>
           <w:sz w:val="20"/>
         </w:rPr>
-        <w:t>西班牙的这一案例反映了欧洲更广泛的转向：在能源危机面前，多个国家正在重新评估其核电站的关停计划。</w:t>
+        <w:t>这些表态发表后不久，核安全委员会的报告出炉，为延至 2030 年开绿灯，但附带一定条件。</w:t>
       </w:r>
     </w:p>
     <w:p/>
@@ -6233,7 +6233,7 @@
           <w:color w:val="1A56DB"/>
           <w:sz w:val="22"/>
         </w:rPr>
-        <w:t>[17] Los defensores de la prórroga argumentan que la energía nuclear ofrece una base estable y libre de emisiones, esencial mientras las renovables maduran.</w:t>
+        <w:t>[17] Dicho informe respondía a la petición formal que las energéticas habían hecho en octubre del año pasado.</w:t>
       </w:r>
     </w:p>
     <w:p>
@@ -6243,7 +6243,7 @@
           <w:color w:val="556677"/>
           <w:sz w:val="20"/>
         </w:rPr>
-        <w:t>延期的支持者认为，核能提供了一种稳定且零排放的基础负荷，这在可再生能源成熟之前至关重要。</w:t>
+        <w:t>该报告是对电力公司去年 10 月提出的正式申请的回应。</w:t>
       </w:r>
     </w:p>
     <w:p/>
@@ -6255,7 +6255,7 @@
           <w:color w:val="1A56DB"/>
           <w:sz w:val="22"/>
         </w:rPr>
-        <w:t>[18] Los críticos, en cambio, advierten que prolongar las centrales retrasa la inversión en renovables y mantiene vivos los riesgos de seguridad y de residuos radiactivos.</w:t>
+        <w:t>[18] “A los extremeños nos pusieron la central nuclear de Almaraz porque nadie la quería y ahora que la queremos nos la van a quitar”, dijo el presidente de la plataforma Sí a Almaraz, Sí al futuro, Fernando Sánchez.</w:t>
       </w:r>
     </w:p>
     <w:p>
@@ -6265,7 +6265,7 @@
           <w:color w:val="556677"/>
           <w:sz w:val="20"/>
         </w:rPr>
-        <w:t>相反，批评者警告说，延长核电站运行会推迟对可再生能源的投资，并使安全风险和放射性废料问题持续存在。</w:t>
+        <w:t>“当年把阿尔马拉斯核电站塞给我们埃斯特雷马杜拉人，是因为没人要；如今我们想要了，却又来把它夺走”，“支持阿尔马拉斯、支持未来”平台主席费尔南多·桑切斯这样说道。</w:t>
       </w:r>
     </w:p>
     <w:p/>
@@ -6277,7 +6277,7 @@
           <w:color w:val="1A56DB"/>
           <w:sz w:val="22"/>
         </w:rPr>
-        <w:t>[19] El equilibrio entre seguridad energética, descarbonización y viabilidad económica se ha convertido en uno de los dilemas más complejos de la política europea contemporánea.</w:t>
+        <w:t>[19] A esta organización la han apoyado partidos políticos de todo color en la región, incluido el propio PSOE, donde este asunto ha generado una clara discrepancia entre la dirección nacional y la regional.</w:t>
       </w:r>
     </w:p>
     <w:p>
@@ -6287,7 +6287,7 @@
           <w:color w:val="556677"/>
           <w:sz w:val="20"/>
         </w:rPr>
-        <w:t>能源安全、脱碳与经济可行性之间的平衡，已成为当代欧洲政治中最复杂的难题之一。</w:t>
+        <w:t>这个组织得到了当地各党派的支持，包括工人社会党本身；在这个问题上，该党全国领导层与地区领导层之间出现了明显的分歧。</w:t>
       </w:r>
     </w:p>
     <w:p/>
@@ -6299,7 +6299,7 @@
           <w:color w:val="1A56DB"/>
           <w:sz w:val="22"/>
         </w:rPr>
-        <w:t>[20] La prórroga de Almaraz es, en el fondo, una prueba de si es posible combinar la urgencia climática con la necesidad de mantener un suministro eléctrico estable y asequible.</w:t>
+        <w:t>[20] En este contexto, la continuidad de Almaraz ayudará a descomprimir la difícil situación del PSOE en la región, castigado en las últimas elecciones autonómicas.</w:t>
       </w:r>
     </w:p>
     <w:p>
@@ -6309,7 +6309,7 @@
           <w:color w:val="556677"/>
           <w:sz w:val="20"/>
         </w:rPr>
-        <w:t>从本质上说，阿尔马拉斯核电站的延期是一场考验：能否将气候紧迫性与维持稳定且可负担的电力供应的需求结合起来。</w:t>
+        <w:t>在此背景下，让阿尔马拉斯继续运行，将有助于缓解工人社会党在该地区的困境——该党在最近的自治区选举中遭到重创。</w:t>
       </w:r>
     </w:p>
     <w:p/>
@@ -6328,7 +6328,7 @@
           <w:color w:val="667788"/>
           <w:sz w:val="20"/>
         </w:rPr>
-        <w:t>B2 考点：虚拟式与条件式的综合运用（si es posible combinar...; dependería de que la central cumpliera）。被动与无人称（estaba prevista, fue publicada, se ha convertido）。间接引语与官方引语（el Gobierno justificó... asegurando que; Sumar afirmó que...）。让步与转折连词（sin embargo, en cambio, por su parte）。动词短语（reavivar el debate, imponer costes, retrasar la descarbonización）。正式学术语体（viabilidad, exposición, descarbonización, prórroga）。观点辨析（政府 vs Sumar vs 地区领导人 vs 企业）。复杂复合句（关系从句 + 目的从句 + 条件从句叠加）。</w:t>
+        <w:t>B2 考点：虚拟式与条件式（puede contribuir a moderar; dependería de...）。间接引语与官方引语（el Gobierno defendió... argumentando que; aseguraba...; dijo...）。让步与转折（Aunque...; Sin embargo...; no solo... sino también...）。被动与无人称（queda fijado, fue anunciada, se produce）。正式学术语体（prórroga, moratoria, clausura, exposición, volatilidad, discrepancia）。观点辨析（政府 vs PP vs PSOE vs Sumar vs 电力公司 vs 地方平台）。复杂复合句（关系从句 + 引语从句 + 让步从句叠加）。数据引用（7%, 15.000 millones, 2027-2035, 2060）。</w:t>
       </w:r>
     </w:p>
     <w:p/>
@@ -6422,6 +6422,59 @@
                 <w:i/>
                 <w:sz w:val="20"/>
               </w:rPr>
+              <w:t>patada hacia adelante</w:t>
+            </w:r>
+          </w:p>
+        </w:tc>
+        <w:tc>
+          <w:tcPr>
+            <w:tcW w:type="dxa" w:w="3009"/>
+          </w:tcPr>
+          <w:p>
+            <w:r>
+              <w:rPr>
+                <w:rFonts w:ascii="Calibri" w:hAnsi="Calibri" w:eastAsia="Microsoft YaHei"/>
+                <w:b w:val="0"/>
+                <w:i w:val="0"/>
+                <w:sz w:val="20"/>
+              </w:rPr>
+              <w:t>把问题往后拖；踢皮球</w:t>
+            </w:r>
+          </w:p>
+        </w:tc>
+        <w:tc>
+          <w:tcPr>
+            <w:tcW w:type="dxa" w:w="3009"/>
+          </w:tcPr>
+          <w:p>
+            <w:r>
+              <w:rPr>
+                <w:rFonts w:ascii="Calibri" w:hAnsi="Calibri" w:eastAsia="Microsoft YaHei"/>
+                <w:b w:val="0"/>
+                <w:i w:val="0"/>
+                <w:sz w:val="18"/>
+              </w:rPr>
+              <w:t>例句：El Gobierno ha dado una patada hacia adelante con la prórroga.</w:t>
+              <w:br/>
+              <w:t>分析：字面义为“向前踢一脚”，是西班牙语中表示“把难题推迟到以后、逃避当下解决”的惯用表达。常见搭配 dar una patada hacia adelante（把问题往后拖）。语境义：本文指政府用延期的方式回避了核电站关闭这一棘手决定，把它推给下一届政府。DELE B2 常考这类习语/惯用表达的语境义，不能按字面理解。</w:t>
+            </w:r>
+          </w:p>
+        </w:tc>
+      </w:tr>
+      <w:tr>
+        <w:tc>
+          <w:tcPr>
+            <w:tcW w:type="dxa" w:w="3009"/>
+            <w:shd w:fill="F8FAFC"/>
+          </w:tcPr>
+          <w:p>
+            <w:r>
+              <w:rPr>
+                <w:rFonts w:ascii="Calibri" w:hAnsi="Calibri" w:eastAsia="Microsoft YaHei"/>
+                <w:b w:val="0"/>
+                <w:i/>
+                <w:sz w:val="20"/>
+              </w:rPr>
               <w:t>prórroga</w:t>
             </w:r>
           </w:p>
@@ -6454,9 +6507,168 @@
                 <w:i w:val="0"/>
                 <w:sz w:val="18"/>
               </w:rPr>
-              <w:t>例句：una orden ministerial... autorizó la prórroga de Almaraz hasta el 8 de junio de 2030.</w:t>
+              <w:t>例句：la prórroga de la central nuclear de Almaraz.</w:t>
               <w:br/>
-              <w:t>分析：源自拉丁语 prorogare（延长），由 pro-（向前）+ rogare（请求）构成，本义“请求延期”。常见搭配 prórroga de un contrato（合同延期）、solicitar una prórroga（申请延期）、conceder una prórroga（批准延期）。语法上为阴性名词。语境义：本文特指核电站“运行寿命的延长”。DELE B2 常考查其与 ampliación（扩大/延期）、extensión（延长）在正式语体中的细微差别：prórroga 更侧重“在期限届满前的续期”。</w:t>
+              <w:t>分析：源自拉丁语 prorogare（延长），由 pro-（向前）+ rogare（请求）构成。常见搭配 prórroga de un contrato（合同延期）、conceder una prórroga（批准延期）、solicitar una prórroga（申请延期）。语法上为阴性名词。语境义：本文特指核电站运行许可的续期。DELE B2 常考其与 ampliación、extensión 的辨析：prórroga 侧重“期限届满前的续期”。</w:t>
+            </w:r>
+          </w:p>
+        </w:tc>
+      </w:tr>
+      <w:tr>
+        <w:tc>
+          <w:tcPr>
+            <w:tcW w:type="dxa" w:w="3009"/>
+            <w:shd w:fill="F8FAFC"/>
+          </w:tcPr>
+          <w:p>
+            <w:r>
+              <w:rPr>
+                <w:rFonts w:ascii="Calibri" w:hAnsi="Calibri" w:eastAsia="Microsoft YaHei"/>
+                <w:b w:val="0"/>
+                <w:i/>
+                <w:sz w:val="20"/>
+              </w:rPr>
+              <w:t>clausura</w:t>
+            </w:r>
+          </w:p>
+        </w:tc>
+        <w:tc>
+          <w:tcPr>
+            <w:tcW w:type="dxa" w:w="3009"/>
+          </w:tcPr>
+          <w:p>
+            <w:r>
+              <w:rPr>
+                <w:rFonts w:ascii="Calibri" w:hAnsi="Calibri" w:eastAsia="Microsoft YaHei"/>
+                <w:b w:val="0"/>
+                <w:i w:val="0"/>
+                <w:sz w:val="20"/>
+              </w:rPr>
+              <w:t>关闭；停运</w:t>
+            </w:r>
+          </w:p>
+        </w:tc>
+        <w:tc>
+          <w:tcPr>
+            <w:tcW w:type="dxa" w:w="3009"/>
+          </w:tcPr>
+          <w:p>
+            <w:r>
+              <w:rPr>
+                <w:rFonts w:ascii="Calibri" w:hAnsi="Calibri" w:eastAsia="Microsoft YaHei"/>
+                <w:b w:val="0"/>
+                <w:i w:val="0"/>
+                <w:sz w:val="18"/>
+              </w:rPr>
+              <w:t>例句：se incumple el calendario de clausura pactado.</w:t>
+              <w:br/>
+              <w:t>分析：源自拉丁语 clausura（封闭），词根 claudere（关闭）。常见搭配 clausura de una central（核电站关闭）、calendario de clausura（关闭时间表）、acto de clausura（闭幕式）。语境义：本文指核电站的“退役关闭”。易混淆词：clausura（关闭/闭幕）vs cierre（关闭，更通用）vs cese（停止/终止）。在核电语境中 clausura 更正式、更常用于“永久关闭”。</w:t>
+            </w:r>
+          </w:p>
+        </w:tc>
+      </w:tr>
+      <w:tr>
+        <w:tc>
+          <w:tcPr>
+            <w:tcW w:type="dxa" w:w="3009"/>
+            <w:shd w:fill="F8FAFC"/>
+          </w:tcPr>
+          <w:p>
+            <w:r>
+              <w:rPr>
+                <w:rFonts w:ascii="Calibri" w:hAnsi="Calibri" w:eastAsia="Microsoft YaHei"/>
+                <w:b w:val="0"/>
+                <w:i/>
+                <w:sz w:val="20"/>
+              </w:rPr>
+              <w:t>moratoria</w:t>
+            </w:r>
+          </w:p>
+        </w:tc>
+        <w:tc>
+          <w:tcPr>
+            <w:tcW w:type="dxa" w:w="3009"/>
+          </w:tcPr>
+          <w:p>
+            <w:r>
+              <w:rPr>
+                <w:rFonts w:ascii="Calibri" w:hAnsi="Calibri" w:eastAsia="Microsoft YaHei"/>
+                <w:b w:val="0"/>
+                <w:i w:val="0"/>
+                <w:sz w:val="20"/>
+              </w:rPr>
+              <w:t>暂停；延期偿付</w:t>
+            </w:r>
+          </w:p>
+        </w:tc>
+        <w:tc>
+          <w:tcPr>
+            <w:tcW w:type="dxa" w:w="3009"/>
+          </w:tcPr>
+          <w:p>
+            <w:r>
+              <w:rPr>
+                <w:rFonts w:ascii="Calibri" w:hAnsi="Calibri" w:eastAsia="Microsoft YaHei"/>
+                <w:b w:val="0"/>
+                <w:i w:val="0"/>
+                <w:sz w:val="18"/>
+              </w:rPr>
+              <w:t>例句：el Partido Popular dejó claro que la moratoria es “insuficiente”.</w:t>
+              <w:br/>
+              <w:t>分析：源自拉丁语 moratorius（延迟的），词根 mora（延迟）。指“正式宣布的暂停或延期”。常见搭配 moratoria nuclear（核电暂停）、declarar una moratoria（宣布暂停）、moratoria de pagos（延期偿付）。语境义：本文中 PP 用 moratoria 指代政府“暂停关闭核电站”的决定，并认为它不够彻底。DELE B2 政治/经济语篇高频词。</w:t>
+            </w:r>
+          </w:p>
+        </w:tc>
+      </w:tr>
+      <w:tr>
+        <w:tc>
+          <w:tcPr>
+            <w:tcW w:type="dxa" w:w="3009"/>
+            <w:shd w:fill="F8FAFC"/>
+          </w:tcPr>
+          <w:p>
+            <w:r>
+              <w:rPr>
+                <w:rFonts w:ascii="Calibri" w:hAnsi="Calibri" w:eastAsia="Microsoft YaHei"/>
+                <w:b w:val="0"/>
+                <w:i/>
+                <w:sz w:val="20"/>
+              </w:rPr>
+              <w:t>volatilidad</w:t>
+            </w:r>
+          </w:p>
+        </w:tc>
+        <w:tc>
+          <w:tcPr>
+            <w:tcW w:type="dxa" w:w="3009"/>
+          </w:tcPr>
+          <w:p>
+            <w:r>
+              <w:rPr>
+                <w:rFonts w:ascii="Calibri" w:hAnsi="Calibri" w:eastAsia="Microsoft YaHei"/>
+                <w:b w:val="0"/>
+                <w:i w:val="0"/>
+                <w:sz w:val="20"/>
+              </w:rPr>
+              <w:t>波动性；不稳定性</w:t>
+            </w:r>
+          </w:p>
+        </w:tc>
+        <w:tc>
+          <w:tcPr>
+            <w:tcW w:type="dxa" w:w="3009"/>
+          </w:tcPr>
+          <w:p>
+            <w:r>
+              <w:rPr>
+                <w:rFonts w:ascii="Calibri" w:hAnsi="Calibri" w:eastAsia="Microsoft YaHei"/>
+                <w:b w:val="0"/>
+                <w:i w:val="0"/>
+                <w:sz w:val="18"/>
+              </w:rPr>
+              <w:t>例句：el escenario geopolítico actual ha generado “una volatilidad de precios”.</w:t>
+              <w:br/>
+              <w:t>分析：源自拉丁语 volatilis（会飞的、易变的），词根 volare（飞）。指“价格或市场剧烈、频繁变动的特性”。常见搭配 volatilidad de precios（价格波动）、volatilidad del mercado（市场波动）、alta volatilidad（高波动性）。语境义：本文指中东局势导致的能源价格剧烈波动，是政府为延期辩护的核心论据。DELE B2 经济类阅读高频词。</w:t>
             </w:r>
           </w:p>
         </w:tc>
@@ -6507,115 +6719,9 @@
                 <w:i w:val="0"/>
                 <w:sz w:val="18"/>
               </w:rPr>
-              <w:t>例句：mitiga la exposición del sistema eléctrico y de los consumidores a subidas de precios.</w:t>
+              <w:t>例句：moderar la exposición de los consumidores a unos picos de precios.</w:t>
               <w:br/>
-              <w:t>分析：源自拉丁语 expositio，由 ex-（向外）+ ponere（放置）构成，本义“摆出、暴露”。一词多义：①暴露（exposición al sol 日晒）②风险敞口（exposición al riesgo 风险敞口，金融/能源语境）③展览（exposición de arte 艺术展）。语境义：本文取“风险敞口”这一专业义，指电力系统面临电价上涨风险的程度。DELE B2 常考其多义辨析，需结合上下文判断。易混淆词：exposición（暴露/展览）vs explosión（爆炸，词形相近）。</w:t>
-            </w:r>
-          </w:p>
-        </w:tc>
-      </w:tr>
-      <w:tr>
-        <w:tc>
-          <w:tcPr>
-            <w:tcW w:type="dxa" w:w="3009"/>
-            <w:shd w:fill="F8FAFC"/>
-          </w:tcPr>
-          <w:p>
-            <w:r>
-              <w:rPr>
-                <w:rFonts w:ascii="Calibri" w:hAnsi="Calibri" w:eastAsia="Microsoft YaHei"/>
-                <w:b w:val="0"/>
-                <w:i/>
-                <w:sz w:val="20"/>
-              </w:rPr>
-              <w:t>descarbonización</w:t>
-            </w:r>
-          </w:p>
-        </w:tc>
-        <w:tc>
-          <w:tcPr>
-            <w:tcW w:type="dxa" w:w="3009"/>
-          </w:tcPr>
-          <w:p>
-            <w:r>
-              <w:rPr>
-                <w:rFonts w:ascii="Calibri" w:hAnsi="Calibri" w:eastAsia="Microsoft YaHei"/>
-                <w:b w:val="0"/>
-                <w:i w:val="0"/>
-                <w:sz w:val="20"/>
-              </w:rPr>
-              <w:t>脱碳</w:t>
-            </w:r>
-          </w:p>
-        </w:tc>
-        <w:tc>
-          <w:tcPr>
-            <w:tcW w:type="dxa" w:w="3009"/>
-          </w:tcPr>
-          <w:p>
-            <w:r>
-              <w:rPr>
-                <w:rFonts w:ascii="Calibri" w:hAnsi="Calibri" w:eastAsia="Microsoft YaHei"/>
-                <w:b w:val="0"/>
-                <w:i w:val="0"/>
-                <w:sz w:val="18"/>
-              </w:rPr>
-              <w:t>例句：retrasa la descarbonización real basada en renovables.</w:t>
-              <w:br/>
-              <w:t>分析：由前缀 des-（去除）+ carbono（碳）+ 后缀 -ización（……化）构成，指“减少碳排放、摆脱对碳基能源依赖的过程”。常见搭配 descarbonización de la economía（经济脱碳）、proceso de descarbonización（脱碳进程）、objetivos de descarbonización（脱碳目标）。这是气候变化领域的学术词汇。语境义：本文指通过发展可再生能源实现“真正”的脱碳。DELE B2 学术阅读中高频出现，常与 transición energética（能源转型）、neutralidad climática（气候中和）配套考查。</w:t>
-            </w:r>
-          </w:p>
-        </w:tc>
-      </w:tr>
-      <w:tr>
-        <w:tc>
-          <w:tcPr>
-            <w:tcW w:type="dxa" w:w="3009"/>
-            <w:shd w:fill="F8FAFC"/>
-          </w:tcPr>
-          <w:p>
-            <w:r>
-              <w:rPr>
-                <w:rFonts w:ascii="Calibri" w:hAnsi="Calibri" w:eastAsia="Microsoft YaHei"/>
-                <w:b w:val="0"/>
-                <w:i/>
-                <w:sz w:val="20"/>
-              </w:rPr>
-              <w:t>apagón</w:t>
-            </w:r>
-          </w:p>
-        </w:tc>
-        <w:tc>
-          <w:tcPr>
-            <w:tcW w:type="dxa" w:w="3009"/>
-          </w:tcPr>
-          <w:p>
-            <w:r>
-              <w:rPr>
-                <w:rFonts w:ascii="Calibri" w:hAnsi="Calibri" w:eastAsia="Microsoft YaHei"/>
-                <w:b w:val="0"/>
-                <w:i w:val="0"/>
-                <w:sz w:val="20"/>
-              </w:rPr>
-              <w:t>停电；大停电</w:t>
-            </w:r>
-          </w:p>
-        </w:tc>
-        <w:tc>
-          <w:tcPr>
-            <w:tcW w:type="dxa" w:w="3009"/>
-          </w:tcPr>
-          <w:p>
-            <w:r>
-              <w:rPr>
-                <w:rFonts w:ascii="Calibri" w:hAnsi="Calibri" w:eastAsia="Microsoft YaHei"/>
-                <w:b w:val="0"/>
-                <w:i w:val="0"/>
-                <w:sz w:val="18"/>
-              </w:rPr>
-              <w:t>例句：un apagón masivo sin precedentes... reavivaron el debate.</w:t>
-              <w:br/>
-              <w:t>分析：由动词 apagar（关、熄灭）+ 增义后缀 -ón 构成，-ón 在此表“突然、强烈”的意味。常见搭配 apagón eléctrico（停电）、apagón masivo/general（大规模停电）、sufrir un apagón（遭遇停电）。语法上为阳性名词。语境义：本文指“去年史无前例的大规模停电”这一具体事件，是引发核电辩论的导火索。易混淆词：apagón（停电）vs corte（中断/断电，更口语）vs avería（故障）。DELE B2 时事阅读中常见。</w:t>
+              <w:t>分析：源自拉丁语 expositio，由 ex-（向外）+ ponere（放置）构成。一词多义：①暴露（exposición al sol）②风险敞口（exposición al riesgo，金融/能源语境）③展览（exposición de arte）。语境义：本文取“风险敞口”这一专业义，指消费者面临价格飙升风险的程度。DELE B2 常考多义辨析。易混淆词：exposición vs explosión（爆炸，词形相近）。</w:t>
             </w:r>
           </w:p>
         </w:tc>
@@ -6666,9 +6772,9 @@
                 <w:i w:val="0"/>
                 <w:sz w:val="18"/>
               </w:rPr>
-              <w:t>例句：Sumar, el socio menor de la coalición de Gobierno, la criticó.</w:t>
+              <w:t>例句：el calendario pactado entre los socios de la coalición del Gobierno.</w:t>
               <w:br/>
-              <w:t>分析：源自拉丁语 coalitio（联合），由 co-（共同）+ alere（滋养、生长）演变而来，指“政党或团体为共同目标组成的联盟”。常见搭配 coalición de Gobierno（执政联盟）、formar una coalición（组建联盟）、socio de coalición（联盟伙伴）。语法上为阴性名词。语境义：本文指西班牙执政的左翼联合政府，其中苏马尔党是小党。DELE B2 政治语篇常考，需辨析 coalición（联盟）vs alianza（同盟，更宽泛）vs pacto（协议）。</w:t>
+              <w:t>分析：源自拉丁语 coalitio（联合）。指“政党为共同执政组成的联盟”。常见搭配 coalición de Gobierno（执政联盟）、socio de coalición（联盟伙伴）、formar una coalición（组建联盟）。语法上为阴性名词。语境义：本文指西班牙 PSOE 与 Sumar 组成的左翼执政联盟。DELE B2 政治语篇常考，与 alianza（同盟）、pacto（协议）辨析。</w:t>
             </w:r>
           </w:p>
         </w:tc>
@@ -6687,7 +6793,7 @@
                 <w:i/>
                 <w:sz w:val="20"/>
               </w:rPr>
-              <w:t>viabilidad</w:t>
+              <w:t>discrepancia</w:t>
             </w:r>
           </w:p>
         </w:tc>
@@ -6703,7 +6809,7 @@
                 <w:i w:val="0"/>
                 <w:sz w:val="20"/>
               </w:rPr>
-              <w:t>可行性；可持续性</w:t>
+              <w:t>分歧；不一致</w:t>
             </w:r>
           </w:p>
         </w:tc>
@@ -6719,9 +6825,9 @@
                 <w:i w:val="0"/>
                 <w:sz w:val="18"/>
               </w:rPr>
-              <w:t>例句：El equilibrio entre seguridad energética, descarbonización y viabilidad económica...</w:t>
+              <w:t>例句：este asunto ha generado una clara discrepancia entre la dirección nacional y la regional.</w:t>
               <w:br/>
-              <w:t>分析：源自拉丁语 via（道路）+ 形容词后缀 -bilis，本义“可通行的”，引申为“可行的、可维持的”。常见搭配 viabilidad económica（经济可行性）、viabilidad técnica（技术可行性）、estudiar la viabilidad（研究可行性）。语法上为阴性名词，形容词形式为 viable（可行的）。语境义：本文指核能延期在经济上是否“划算、可持续”。DELE B2 议论文写作高频词，常与 factible、sostenible 辨析：viable 侧重“可行”，sostenible 侧重“可持续”。</w:t>
+              <w:t>分析：源自拉丁语 discrepantia，由 dis-（分离）+ crepare（发出声响）构成，本义“声音不协调”，引申为“意见分歧”。常见搭配 discrepancia entre（……之间的分歧）、discrepancia de opiniones（意见分歧）、surgir una discrepancia（出现分歧）。语法上为阴性名词。语境义：本文指 PSOE 全国领导层与埃斯特雷马杜拉地区领导层在核电问题上的立场分歧。DELE B2 常考其与 diferencia（差异）、conflicto（冲突）的辨析。</w:t>
             </w:r>
           </w:p>
         </w:tc>
@@ -6740,7 +6846,7 @@
                 <w:i/>
                 <w:sz w:val="20"/>
               </w:rPr>
-              <w:t>reavivar</w:t>
+              <w:t>descomprimir</w:t>
             </w:r>
           </w:p>
         </w:tc>
@@ -6756,7 +6862,7 @@
                 <w:i w:val="0"/>
                 <w:sz w:val="20"/>
               </w:rPr>
-              <w:t>重新点燃；再度激起</w:t>
+              <w:t>缓解；减压</w:t>
             </w:r>
           </w:p>
         </w:tc>
@@ -6772,9 +6878,9 @@
                 <w:i w:val="0"/>
                 <w:sz w:val="18"/>
               </w:rPr>
-              <w:t>例句：un apagón masivo... y la subida de los precios... reavivaron el debate.</w:t>
+              <w:t>例句：la continuidad de Almaraz ayudará a descomprimir la difícil situación del PSOE.</w:t>
               <w:br/>
-              <w:t>分析：由前缀 re-（再次）+ avivar（点燃、使活跃）构成，指“使已沉寂的事物重新活跃起来”。常见搭配 reavivar el debate（重新点燃辩论）、reavivar la polémica（再度引发争议）、reavivar el interés（重燃兴趣）。语法上为规则 -ar 动词。语境义：本文指停电和涨价“重新引发了”关于核电关停的辩论。易混淆词：reavivar（重新激起）vs revivir（复活、重现）vs renovar（更新）。</w:t>
+              <w:t>分析：由前缀 des-（去除）+ comprimir（压缩）构成，本义“减压”，引申为“缓解紧张/压力”。常见搭配 descomprimir la situación（缓解局势）、descomprimir la tensión（缓解紧张）、descomprimir un archivo（解压文件，计算机义）。语境义：本文用比喻义，指核电站延期能“缓解” PSOE 在当地的选举困境。DELE B2 常考其引申义（政治/社会语境）vs 本义（技术语境）的区分。</w:t>
             </w:r>
           </w:p>
         </w:tc>
@@ -6793,7 +6899,7 @@
                 <w:i/>
                 <w:sz w:val="20"/>
               </w:rPr>
-              <w:t>mitigar</w:t>
+              <w:t>castigado</w:t>
             </w:r>
           </w:p>
         </w:tc>
@@ -6809,7 +6915,7 @@
                 <w:i w:val="0"/>
                 <w:sz w:val="20"/>
               </w:rPr>
-              <w:t>减轻；缓和</w:t>
+              <w:t>受惩罚的；受重创的</w:t>
             </w:r>
           </w:p>
         </w:tc>
@@ -6825,115 +6931,9 @@
                 <w:i w:val="0"/>
                 <w:sz w:val="18"/>
               </w:rPr>
-              <w:t>例句：la prórroga... mitiga la exposición del sistema eléctrico.</w:t>
+              <w:t>例句：el PSOE en la región, castigado en las últimas elecciones autonómicas.</w:t>
               <w:br/>
-              <w:t>分析：源自拉丁语 mitigare（使柔和），词根 mitis（温和的）。常见搭配 mitigar el impacto（减轻影响）、mitigar los efectos（缓解后果）、mitigar el riesgo（降低风险）。语法上为规则 -ar 动词，其名词形式为 mitigación（缓解）。语境义：本文指延期“减轻”了电力系统面临电价上涨的风险。DELE B2 常考其与 reducir（减少）、aliviar（缓解）的辨析：mitigar 更正式，多用于书面语。</w:t>
-            </w:r>
-          </w:p>
-        </w:tc>
-      </w:tr>
-      <w:tr>
-        <w:tc>
-          <w:tcPr>
-            <w:tcW w:type="dxa" w:w="3009"/>
-            <w:shd w:fill="F8FAFC"/>
-          </w:tcPr>
-          <w:p>
-            <w:r>
-              <w:rPr>
-                <w:rFonts w:ascii="Calibri" w:hAnsi="Calibri" w:eastAsia="Microsoft YaHei"/>
-                <w:b w:val="0"/>
-                <w:i/>
-                <w:sz w:val="20"/>
-              </w:rPr>
-              <w:t>impensado</w:t>
-            </w:r>
-          </w:p>
-        </w:tc>
-        <w:tc>
-          <w:tcPr>
-            <w:tcW w:type="dxa" w:w="3009"/>
-          </w:tcPr>
-          <w:p>
-            <w:r>
-              <w:rPr>
-                <w:rFonts w:ascii="Calibri" w:hAnsi="Calibri" w:eastAsia="Microsoft YaHei"/>
-                <w:b w:val="0"/>
-                <w:i w:val="0"/>
-                <w:sz w:val="20"/>
-              </w:rPr>
-              <w:t>未预料到的；意外的</w:t>
-            </w:r>
-          </w:p>
-        </w:tc>
-        <w:tc>
-          <w:tcPr>
-            <w:tcW w:type="dxa" w:w="3009"/>
-          </w:tcPr>
-          <w:p>
-            <w:r>
-              <w:rPr>
-                <w:rFonts w:ascii="Calibri" w:hAnsi="Calibri" w:eastAsia="Microsoft YaHei"/>
-                <w:b w:val="0"/>
-                <w:i w:val="0"/>
-                <w:sz w:val="18"/>
-              </w:rPr>
-              <w:t>例句：a subidas de precios imprevistas.</w:t>
-              <w:br/>
-              <w:t>分析：（注：原文用 imprevistas）源自拉丁语 improvisus，由 in-（否定）+ providere（预见）构成，形容词形式为 imprevisto/previsto，本义“没有预先看到的”。常见搭配 subida imprevista（意外上涨）、gasto imprevisto（意外开支）、situación imprevista（意外情况）。语法上 imprevisto 的阴性为 imprevista。语境义：本文指“不可预见的电价上涨”。易混淆词：imprevisto（意外的）vs improvisado（即兴的、临时拼凑的）vs imprevisible（无法预测的）。</w:t>
-            </w:r>
-          </w:p>
-        </w:tc>
-      </w:tr>
-      <w:tr>
-        <w:tc>
-          <w:tcPr>
-            <w:tcW w:type="dxa" w:w="3009"/>
-            <w:shd w:fill="F8FAFC"/>
-          </w:tcPr>
-          <w:p>
-            <w:r>
-              <w:rPr>
-                <w:rFonts w:ascii="Calibri" w:hAnsi="Calibri" w:eastAsia="Microsoft YaHei"/>
-                <w:b w:val="0"/>
-                <w:i/>
-                <w:sz w:val="20"/>
-              </w:rPr>
-              <w:t>despoblada</w:t>
-            </w:r>
-          </w:p>
-        </w:tc>
-        <w:tc>
-          <w:tcPr>
-            <w:tcW w:type="dxa" w:w="3009"/>
-          </w:tcPr>
-          <w:p>
-            <w:r>
-              <w:rPr>
-                <w:rFonts w:ascii="Calibri" w:hAnsi="Calibri" w:eastAsia="Microsoft YaHei"/>
-                <w:b w:val="0"/>
-                <w:i w:val="0"/>
-                <w:sz w:val="20"/>
-              </w:rPr>
-              <w:t>人口稀少的；荒芜的</w:t>
-            </w:r>
-          </w:p>
-        </w:tc>
-        <w:tc>
-          <w:tcPr>
-            <w:tcW w:type="dxa" w:w="3009"/>
-          </w:tcPr>
-          <w:p>
-            <w:r>
-              <w:rPr>
-                <w:rFonts w:ascii="Calibri" w:hAnsi="Calibri" w:eastAsia="Microsoft YaHei"/>
-                <w:b w:val="0"/>
-                <w:i w:val="0"/>
-                <w:sz w:val="18"/>
-              </w:rPr>
-              <w:t>例句：en la Extremadura rural y despoblada.</w:t>
-              <w:br/>
-              <w:t>分析：由前缀 des-（去除、否定）+ poblada（有人居住的，源自 poblar“使有人居住”）构成，指“人口稀少、居民流失”。常见搭配 zona despoblada（人口稀少地区）、España despoblada（西班牙空心化地区）、despoblación rural（农村人口流失）。语境义：本文指埃斯特雷马杜拉农村地区“人口流失严重”。DELE B2 社会议题高频词，常与 la España vaciada（“被掏空的西班牙”，指人口外流的农村地区）这一时事概念配套考查。</w:t>
+              <w:t>分析：源自动词 castigar（惩罚，源自拉丁语 castigare），此处用过去分词作形容词，指“在选举中遭受挫败、被选民惩罚”。常见搭配 partido castigado（受挫的政党）、castigar en las urnas（在投票中惩罚）、castigo electoral（选举惩罚）。语境义：本文指 PSOE 在埃斯特雷马杜拉自治区选举中得票大跌、被选民“惩罚”。DELE B2 政治语篇常考 castigado 的比喻义（非字面“体罚”）。</w:t>
             </w:r>
           </w:p>
         </w:tc>
@@ -6954,7 +6954,7 @@
           <w:b/>
           <w:sz w:val="22"/>
         </w:rPr>
-        <w:t>1. ¿En qué año estaba previsto cerrar la central nuclear de Almaraz?</w:t>
+        <w:t>1. ¿Qué porcentaje de la electricidad que consume España produce la central de Almaraz?</w:t>
       </w:r>
     </w:p>
     <w:p>
@@ -6965,7 +6965,7 @@
         <w:rPr>
           <w:sz w:val="20"/>
         </w:rPr>
-        <w:t>A. En 2030.</w:t>
+        <w:t>A. Alrededor del 3%.</w:t>
       </w:r>
     </w:p>
     <w:p>
@@ -6977,7 +6977,7 @@
           <w:color w:val="16A34A"/>
           <w:sz w:val="20"/>
         </w:rPr>
-        <w:t>B. En 2028.  ✔</w:t>
+        <w:t>B. En torno al 7%.  ✔</w:t>
       </w:r>
     </w:p>
     <w:p>
@@ -6988,7 +6988,7 @@
         <w:rPr>
           <w:sz w:val="20"/>
         </w:rPr>
-        <w:t>C. En 2035.</w:t>
+        <w:t>C. Cerca del 15%.</w:t>
       </w:r>
     </w:p>
     <w:p>
@@ -6999,7 +6999,7 @@
         <w:rPr>
           <w:sz w:val="20"/>
         </w:rPr>
-        <w:t>D. En 2026.</w:t>
+        <w:t>D. Más del 20%.</w:t>
       </w:r>
     </w:p>
     <w:p>
@@ -7011,7 +7011,7 @@
           <w:color w:val="16A34A"/>
           <w:sz w:val="18"/>
         </w:rPr>
-        <w:t>✅ 答案：B  |  El texto dice (párrafo 2) que Almaraz “estaba prevista para cerrar en 2028”.  |  原文第 2 段说阿尔马拉斯“原定于 2028 年关闭”，故选 B。此题考查直接定位。</w:t>
+        <w:t>✅ 答案：B  |  El texto dice (párrafo 2) que Almaraz produce “en torno al 7% de la energía eléctrica que consume España”.  |  原文第 2 段说阿尔马拉斯生产“西班牙约 7% 的电力”，故选 B（En torno al 7% = 约 7%）。此题考查直接定位。</w:t>
       </w:r>
     </w:p>
     <w:p/>
@@ -7021,7 +7021,7 @@
           <w:b/>
           <w:sz w:val="22"/>
         </w:rPr>
-        <w:t>2. Según el artículo, ¿cuál fue el detonante directo que llevó al Gobierno a reconsiderar el cierre nuclear?</w:t>
+        <w:t>2. ¿Qué postura adoptó el Partido Popular ante la moratoria?</w:t>
       </w:r>
     </w:p>
     <w:p>
@@ -7032,7 +7032,7 @@
         <w:rPr>
           <w:sz w:val="20"/>
         </w:rPr>
-        <w:t>A. Una exigencia de la Unión Europea.</w:t>
+        <w:t>A. La consideró suficiente.</w:t>
       </w:r>
     </w:p>
     <w:p>
@@ -7044,7 +7044,7 @@
           <w:color w:val="16A34A"/>
           <w:sz w:val="20"/>
         </w:rPr>
-        <w:t>B. El apagón masivo del año pasado y la subida de precios causada por la guerra en Oriente Medio.  ✔</w:t>
+        <w:t>B. La consideró insuficiente y pidió cancelar el calendario de cierres.  ✔</w:t>
       </w:r>
     </w:p>
     <w:p>
@@ -7055,7 +7055,7 @@
         <w:rPr>
           <w:sz w:val="20"/>
         </w:rPr>
-        <w:t>C. La presión de las empresas.</w:t>
+        <w:t>C. Se opuso a la energía nuclear.</w:t>
       </w:r>
     </w:p>
     <w:p>
@@ -7066,7 +7066,7 @@
         <w:rPr>
           <w:sz w:val="20"/>
         </w:rPr>
-        <w:t>D. El cambio climático.</w:t>
+        <w:t>D. No se pronunció.</w:t>
       </w:r>
     </w:p>
     <w:p>
@@ -7078,7 +7078,7 @@
           <w:color w:val="16A34A"/>
           <w:sz w:val="18"/>
         </w:rPr>
-        <w:t>✅ 答案：B  |  El párrafo 4 señala que “un apagón masivo... y la subida de los precios... reavivaron el debate”. Hay que entender reavivar（重新点燃）como indicio causal para deducir que el apagón y la subida de precios fueron el detonante.  |  第 4 段指出“大规模停电……和能源价格上涨……重新点燃了辩论”。需理解 reavivar（重新点燃）所暗示的因果关系，推断出停电与涨价是导火索，故选 B。此题考查因果推理。</w:t>
+        <w:t>✅ 答案：B  |  El párrafo 5 muestra que el PP calificó la moratoria de “insuficiente” y pidió “cancelar” el calendario de cierres. Hay que identificar la postura específica de este actor político frente a la del Gobierno.  |  第 5 段显示人民党认为这次暂停“不够”，并要求“取消”关闭时间表。需识别这一政治主体的具体立场（与政府立场相区别），故选 B。此题考查观点辨析。</w:t>
       </w:r>
     </w:p>
     <w:p/>
@@ -7088,7 +7088,7 @@
           <w:b/>
           <w:sz w:val="22"/>
         </w:rPr>
-        <w:t>3. ¿Cuál es la crítica central de Sumar a la decisión de prorrogar Almaraz?</w:t>
+        <w:t>3. ¿Hasta qué año aspiran a llevar la clausura de la central las compañías eléctricas?</w:t>
       </w:r>
     </w:p>
     <w:p>
@@ -7099,7 +7099,18 @@
         <w:rPr>
           <w:sz w:val="20"/>
         </w:rPr>
-        <w:t>A. Que la prórroga es demasiado corta.</w:t>
+        <w:t>A. Hasta 2030.</w:t>
+      </w:r>
+    </w:p>
+    <w:p>
+      <w:pPr>
+        <w:ind w:left="567"/>
+      </w:pPr>
+      <w:r>
+        <w:rPr>
+          <w:sz w:val="20"/>
+        </w:rPr>
+        <w:t>B. Hasta 2035.</w:t>
       </w:r>
     </w:p>
     <w:p>
@@ -7111,7 +7122,7 @@
           <w:color w:val="16A34A"/>
           <w:sz w:val="20"/>
         </w:rPr>
-        <w:t>B. Que se basa en presión empresarial y no en razones técnicas, ambientales o económicas, y que retrasa la descarbonización real.  ✔</w:t>
+        <w:t>C. Hasta 2060.  ✔</w:t>
       </w:r>
     </w:p>
     <w:p>
@@ -7122,18 +7133,7 @@
         <w:rPr>
           <w:sz w:val="20"/>
         </w:rPr>
-        <w:t>C. Que la central es demasiado antigua.</w:t>
-      </w:r>
-    </w:p>
-    <w:p>
-      <w:pPr>
-        <w:ind w:left="567"/>
-      </w:pPr>
-      <w:r>
-        <w:rPr>
-          <w:sz w:val="20"/>
-        </w:rPr>
-        <w:t>D. Que deberían cerrarse más centrales pero conservar Almaraz.</w:t>
+        <w:t>D. Hasta 2028.</w:t>
       </w:r>
     </w:p>
     <w:p>
@@ -7145,7 +7145,7 @@
           <w:color w:val="16A34A"/>
           <w:sz w:val="18"/>
         </w:rPr>
-        <w:t>✅ 答案：B  |  Hay que distinguir las posturas de distintos actores: los párrafos 10-11 muestran que Sumar cree que la decisión se basa en “presión empresarial” y que “retrasa la descarbonización real”. Es un ejercicio de discernimiento del contraargumento.  |  需区分不同主体的观点：第 10-11 段明确指出苏马尔党认为决定基于“企业施压”、会“推迟真正的脱碳”。这是对反方（政府）论点的辨析，故选 B。此题考查观点辨析。</w:t>
+        <w:t>✅ 答案：C  |  El párrafo 7 dice que las compañías “aspiran a llevar su clausura hasta 2060, mucho más allá del calendario actual”. Hay que inferir que 2060 es su objetivo a largo plazo, distinto de la fecha oficial de 2030.  |  第 7 段说电力公司“希望把关闭推迟到 2060 年，远超当前时间表”。需推断出 2060 是它们的长期目标，与官方 2030 年不同，故选 C。此题考查推理判断。</w:t>
       </w:r>
     </w:p>
     <w:p/>
@@ -7155,7 +7155,7 @@
           <w:b/>
           <w:sz w:val="22"/>
         </w:rPr>
-        <w:t>4. ¿Cuál es la razón principal que el Gobierno dio para justificar la prórroga?</w:t>
+        <w:t>4. ¿Cuál es el argumento central del Gobierno para justificar la prórroga?</w:t>
       </w:r>
     </w:p>
     <w:p>
@@ -7166,7 +7166,7 @@
         <w:rPr>
           <w:sz w:val="20"/>
         </w:rPr>
-        <w:t>A. Que la central genera más beneficios.</w:t>
+        <w:t>A. Que la central genera beneficios.</w:t>
       </w:r>
     </w:p>
     <w:p>
@@ -7178,7 +7178,7 @@
           <w:color w:val="16A34A"/>
           <w:sz w:val="20"/>
         </w:rPr>
-        <w:t>B. Que una prórroga limitada mitiga la exposición del sistema y de los consumidores a subidas de precios imprevistas.  ✔</w:t>
+        <w:t>B. Que la prórroga coyuntural puede moderar la exposición de los consumidores a picos de precios no previstos.  ✔</w:t>
       </w:r>
     </w:p>
     <w:p>
@@ -7189,7 +7189,7 @@
         <w:rPr>
           <w:sz w:val="20"/>
         </w:rPr>
-        <w:t>C. Que la central no tiene ningún riesgo.</w:t>
+        <w:t>C. Que la central no tiene riesgos.</w:t>
       </w:r>
     </w:p>
     <w:p>
@@ -7200,7 +7200,7 @@
         <w:rPr>
           <w:sz w:val="20"/>
         </w:rPr>
-        <w:t>D. Para complacer a las empresas.</w:t>
+        <w:t>D. Que es una exigencia de la UE.</w:t>
       </w:r>
     </w:p>
     <w:p>
@@ -7212,7 +7212,7 @@
           <w:color w:val="16A34A"/>
           <w:sz w:val="18"/>
         </w:rPr>
-        <w:t>✅ 答案：B  |  La cita oficial del párrafo 6 “mitiga la exposición del sistema eléctrico y de los consumidores a subidas de precios imprevistas” es una oración compleja con léxico técnico (exposición, imprevistas), cuyo sentido completo hay que desentrañar.  |  第 6 段官方引语“减轻电力系统和消费者面临不可预见电价上涨的风险敞口”是含专业词 exposición、imprevistas 的复合句，需完整理解其语义才能作答，故选 B。此题考查长句理解与词汇深度。</w:t>
+        <w:t>✅ 答案：B  |  La cita del párrafo 14 (“la prórroga, coyuntural, puede contribuir a moderar la exposición... a unos picos de precios... no previstos”) es una oración compleja con léxico técnico (exposición, picos, coyuntural), cuyo sentido completo hay que desentrañar.  |  第 14 段引语“这一临时性延期有助于减轻消费者面临……此前未预见的……价格飙升的风险敞口”是含专业词（exposición、picos、coyuntural）的复合句，需完整理解语义才能作答，故选 B。此题考查长句理解与词汇深度。</w:t>
       </w:r>
     </w:p>
     <w:p/>
@@ -7222,7 +7222,7 @@
           <w:b/>
           <w:sz w:val="22"/>
         </w:rPr>
-        <w:t>5. ¿En qué aspectos es importante la central de Almaraz para Extremadura?</w:t>
+        <w:t>5. ¿Cuánto está valorada la instalación de Almaraz?</w:t>
       </w:r>
     </w:p>
     <w:p>
@@ -7234,7 +7234,7 @@
           <w:color w:val="16A34A"/>
           <w:sz w:val="20"/>
         </w:rPr>
-        <w:t>A. Aporta cerca del 7% de la electricidad nacional y es clave para la industria y el empleo rural.  ✔</w:t>
+        <w:t>A. 15.000 millones de euros.  ✔</w:t>
       </w:r>
     </w:p>
     <w:p>
@@ -7245,7 +7245,7 @@
         <w:rPr>
           <w:sz w:val="20"/>
         </w:rPr>
-        <w:t>B. Es la única atracción turística de la región.</w:t>
+        <w:t>B. 7.000 millones de euros.</w:t>
       </w:r>
     </w:p>
     <w:p>
@@ -7256,7 +7256,7 @@
         <w:rPr>
           <w:sz w:val="20"/>
         </w:rPr>
-        <w:t>C. Solo genera empleo.</w:t>
+        <w:t>C. 1.500 millones de euros.</w:t>
       </w:r>
     </w:p>
     <w:p>
@@ -7267,7 +7267,7 @@
         <w:rPr>
           <w:sz w:val="20"/>
         </w:rPr>
-        <w:t>D. Solo produce electricidad, sin otro efecto.</w:t>
+        <w:t>D. 20.000 millones de euros.</w:t>
       </w:r>
     </w:p>
     <w:p>
@@ -7279,7 +7279,7 @@
           <w:color w:val="16A34A"/>
           <w:sz w:val="18"/>
         </w:rPr>
-        <w:t>✅ 答案：A  |  El párrafo 14 señala que “aporta alrededor del 7% de la producción eléctrica” y que “es una fuente clave de industria y empleo”.  |  第 14 段指出“贡献约 7% 的电力生产”且“是产业和就业的关键来源”，故选 A。此题考查直接定位。</w:t>
+        <w:t>✅ 答案：A  |  El texto dice (párrafo 12) que “la instalación está valorada en 15.000 millones de euros”.  |  原文第 12 段说“该设施估值高达 150 亿欧元”，故选 A。此题考查直接定位。</w:t>
       </w:r>
     </w:p>
     <w:p/>
@@ -7289,7 +7289,7 @@
           <w:b/>
           <w:sz w:val="22"/>
         </w:rPr>
-        <w:t>6. ¿Qué actitud mostró la presidenta regional María Guardiola ante la prórroga?</w:t>
+        <w:t>6. ¿Quién dijo que “España no puede permitirse el lujo de cerrar las nucleares”?</w:t>
       </w:r>
     </w:p>
     <w:p>
@@ -7300,7 +7300,7 @@
         <w:rPr>
           <w:sz w:val="20"/>
         </w:rPr>
-        <w:t>A. De oposición.</w:t>
+        <w:t>A. El ministro de Transición Ecológica.</w:t>
       </w:r>
     </w:p>
     <w:p>
@@ -7312,7 +7312,7 @@
           <w:color w:val="16A34A"/>
           <w:sz w:val="20"/>
         </w:rPr>
-        <w:t>B. De bienvenida, porque aporta certeza y protege la actividad local.  ✔</w:t>
+        <w:t>B. Mario Ruiz-Tagle, consejero delegado de Iberdrola España.  ✔</w:t>
       </w:r>
     </w:p>
     <w:p>
@@ -7323,7 +7323,7 @@
         <w:rPr>
           <w:sz w:val="20"/>
         </w:rPr>
-        <w:t>C. Neutral.</w:t>
+        <w:t>C. Fernando Sánchez.</w:t>
       </w:r>
     </w:p>
     <w:p>
@@ -7334,7 +7334,7 @@
         <w:rPr>
           <w:sz w:val="20"/>
         </w:rPr>
-        <w:t>D. No se pronunció.</w:t>
+        <w:t>D. El presidente del Partido Popular.</w:t>
       </w:r>
     </w:p>
     <w:p>
@@ -7346,7 +7346,7 @@
           <w:color w:val="16A34A"/>
           <w:sz w:val="18"/>
         </w:rPr>
-        <w:t>✅ 答案：B  |  El párrafo 15 dice que ella “celebró la decisión” y la calificó de “una decisión que aporta certeza”.  |  第 15 段说她“对这一决定表示欢迎”，称其“带来确定性”，故选 B。此题考查直接定位。</w:t>
+        <w:t>✅ 答案：B  |  El párrafo 15 atribuye esta cita a “el consejero delegado de Iberdrola España, Mario Ruiz-Tagle”.  |  第 15 段明确这句话出自“伊维尔德罗拉西班牙公司首席执行官马里奥·鲁伊斯-塔格莱”，故选 B。此题考查直接定位与引语归属。</w:t>
       </w:r>
     </w:p>
     <w:p/>
@@ -7356,7 +7356,7 @@
           <w:b/>
           <w:sz w:val="22"/>
         </w:rPr>
-        <w:t>7. Según el final del artículo, ¿de qué es, en esencia, una prueba la prórroga de Almaraz?</w:t>
+        <w:t>7. ¿Qué revela la cita de Fernando Sánchez sobre la relación de los extremeños con la central?</w:t>
       </w:r>
     </w:p>
     <w:p>
@@ -7367,7 +7367,7 @@
         <w:rPr>
           <w:sz w:val="20"/>
         </w:rPr>
-        <w:t>A. De si la central es segura.</w:t>
+        <w:t>A. Que siempre quisieron la central.</w:t>
       </w:r>
     </w:p>
     <w:p>
@@ -7379,7 +7379,7 @@
           <w:color w:val="16A34A"/>
           <w:sz w:val="20"/>
         </w:rPr>
-        <w:t>B. De si es posible combinar la urgencia climática con un suministro eléctrico estable y asequible.  ✔</w:t>
+        <w:t>B. Que antes nadie quería la central, pero ahora los extremeños defienden su continuidad.  ✔</w:t>
       </w:r>
     </w:p>
     <w:p>
@@ -7390,7 +7390,7 @@
         <w:rPr>
           <w:sz w:val="20"/>
         </w:rPr>
-        <w:t>C. De si el Gobierno es popular.</w:t>
+        <w:t>C. Que quieren cerrarla inmediatamente.</w:t>
       </w:r>
     </w:p>
     <w:p>
@@ -7401,7 +7401,7 @@
         <w:rPr>
           <w:sz w:val="20"/>
         </w:rPr>
-        <w:t>D. De si las empresas pueden obtener beneficios.</w:t>
+        <w:t>D. Que no les importa la central.</w:t>
       </w:r>
     </w:p>
     <w:p>
@@ -7413,7 +7413,7 @@
           <w:color w:val="16A34A"/>
           <w:sz w:val="18"/>
         </w:rPr>
-        <w:t>✅ 答案：B  |  Hay que integrar los párrafos 19 y 20: el 19 plantea el “equilibrio entre seguridad energética, descarbonización y viabilidad económica” como dilema complejo, y el 20 concluye que la prórroga es una prueba de “combinar la urgencia climática con... un suministro estable y asequible”.  |  需综合第 19、20 段：第 19 段提出“能源安全、脱碳与经济可行性之间的平衡”是复杂难题，第 20 段总结延期是考验“能否将气候紧迫性与稳定、可负担的电力供应结合起来”。整合两段才能得出完整答案，故选 B。此题考查跨段落综合。</w:t>
+        <w:t>✅ 答案：B  |  La cita del párrafo 18 (“nos pusieron la central... porque nadie la quería y ahora que la queremos nos la van a quitar”) revela un cambio de actitud: de rechazo inicial a defensa actual. Hay que interpretar el tono irónico y la evolución de la postura local.  |  第 18 段引语“当年没人要才塞给我们，如今我们想要了却要夺走”揭示了当地人态度的转变：从最初的排斥到现在的捍卫。需解读其中的反讽语气和立场演变，故选 B。此题考查观点辨析与推理。</w:t>
       </w:r>
     </w:p>
     <w:p/>
@@ -7423,7 +7423,7 @@
           <w:b/>
           <w:sz w:val="22"/>
         </w:rPr>
-        <w:t>8. ¿Qué actitud general del autor hacia la prórroga nuclear en España se puede inferir del conjunto del texto?</w:t>
+        <w:t>8. ¿Qué conclusión general se puede extraer del artículo sobre la política nuclear española?</w:t>
       </w:r>
     </w:p>
     <w:p>
@@ -7434,7 +7434,7 @@
         <w:rPr>
           <w:sz w:val="20"/>
         </w:rPr>
-        <w:t>A. Apoya plenamente al Gobierno.</w:t>
+        <w:t>A. La decisión está cerrada de forma definitiva.</w:t>
       </w:r>
     </w:p>
     <w:p>
@@ -7446,7 +7446,7 @@
           <w:color w:val="16A34A"/>
           <w:sz w:val="20"/>
         </w:rPr>
-        <w:t>B. Presenta de forma objetiva la controversia entre múltiples partes y la sitúa como un dilema general de la transición energética europea.  ✔</w:t>
+        <w:t>B. La prórroga traslada la decisión final a un futuro Gobierno y refleja un profundo conflicto político, económico y territorial.  ✔</w:t>
       </w:r>
     </w:p>
     <w:p>
@@ -7457,7 +7457,7 @@
         <w:rPr>
           <w:sz w:val="20"/>
         </w:rPr>
-        <w:t>C. Se opone firmemente a la energía nuclear.</w:t>
+        <w:t>C. Todas las partes están de acuerdo.</w:t>
       </w:r>
     </w:p>
     <w:p>
@@ -7468,7 +7468,7 @@
         <w:rPr>
           <w:sz w:val="20"/>
         </w:rPr>
-        <w:t>D. Solo le interesan los beneficios empresariales.</w:t>
+        <w:t>D. La energía nuclear dejará de usarse en 2026.</w:t>
       </w:r>
     </w:p>
     <w:p>
@@ -7480,7 +7480,7 @@
           <w:color w:val="16A34A"/>
           <w:sz w:val="18"/>
         </w:rPr>
-        <w:t>✅ 答案：B  |  El texto presenta con objetividad las posturas del Gobierno, Sumar, la presidenta regional y las empresas (párrafos 6-15), y al final lo eleva a un “giro más amplio en Europa” (párrafo 16) y a “uno de los dilemas más complejos de la política europea” (párrafo 19), sin tomar partido explícito.  |  全文客观呈现政府、苏马尔党、地区领导人、企业等多方观点（第 6-15 段），并在结尾将其上升为“欧洲更广泛的转向”（第 16 段）和“当代欧洲政治最复杂的难题”（第 19 段），未明确站队。综合推断，作者态度是客观呈现争议，故选 B。此题考查作者态度推断与观点辨析。</w:t>
+        <w:t>✅ 答案：B  |  Hay que integrar los párrafos 1, 4, 5, 8-10 y 20: la decisión se describe como “una patada hacia adelante”, el cierre queda para “una nueva legislatura”, y hay conflicto entre Gobierno, PP, PSOE regional, Sumar, eléctricas y plataformas locales. La conclusión es que se trata de un conflicto abierto y trasladado al futuro.  |  需综合第 1、4、5、8-10、20 段：决定被描述为“把问题往后踢”，关闭被推到“新一届议会任期”，且政府、人民党、地区工人社会党、苏马尔党、电力公司和地方平台之间存在冲突。结论是这是一个悬而未决、被推迟到未来的深层政治经济领土冲突，故选 B。此题考查跨段落综合。</w:t>
       </w:r>
     </w:p>
     <w:p/>

</xml_diff>